<commit_message>
docs: Architecture v3 + HLD v8 with enhanced Virtual Tagging
Architecture v3 draw.io:
- Added Virtual Tagging box in Frontend section
- Members DynamoDB shows +allocationRules +businessUnits
- Bedrock shows BU-aware queries
- Green arrow from Virtual Tagging to API Gateway

HLD v8 Section 5 (Virtual Tagging) now includes:
- 5.1 Business Unit Definition (If-This-Then-That flow)
- 5.2 Rule Dimensions & Operators (account/service/tag)
- 5.3 Shared Cost Splitting (even/proportional/custom %)
- 5.4 Processing Status & Transparency (24h delay)
- 5.5 AI Agent Integration (BU-aware queries)
- 5.6 Dashboard Visualization (treemap + allocation %)
- 5.7 Data Model (allocationRules schema)
</commit_message>
<xml_diff>
--- a/SlashMyBill-HLD-v8.docx
+++ b/SlashMyBill-HLD-v8.docx
@@ -82,7 +82,7 @@
         <w:spacing w:after="40"/>
       </w:pPr>
       <w:r>
-        <w:t>2. Architecture Overview</w:t>
+        <w:t>2. Architecture</w:t>
       </w:r>
     </w:p>
     <w:p>
@@ -106,7 +106,7 @@
         <w:spacing w:after="40"/>
       </w:pPr>
       <w:r>
-        <w:t>5. Cost Allocation &amp; Virtual Tagging</w:t>
+        <w:t>5. Virtual Tagging &amp; Cost Allocation</w:t>
       </w:r>
     </w:p>
     <w:p>
@@ -114,7 +114,7 @@
         <w:spacing w:after="40"/>
       </w:pPr>
       <w:r>
-        <w:t>6. AI Agent Data Flow</w:t>
+        <w:t>6. AI Agent</w:t>
       </w:r>
     </w:p>
     <w:p>
@@ -154,7 +154,7 @@
         <w:spacing w:after="40"/>
       </w:pPr>
       <w:r>
-        <w:t>11. Learning Cycle &amp; Tip Scoring</w:t>
+        <w:t>11. Learning Cycle</w:t>
       </w:r>
     </w:p>
     <w:p>
@@ -231,7 +231,7 @@
     </w:p>
     <w:p>
       <w:r>
-        <w:t>SlashMyBill is an AI-powered AWS FinOps platform with multi-account support, a BI-grade dashboard with 7 interactive widgets, Finout-style cost allocation with virtual tagging, a self-improving learning cycle with tip scoring, CloudWatch-based rightsizing, region-aware pricing with actual instance types, and 72 optimization tips with automated checks. Built on Apache ECharts, Amazon Bedrock Nova 2 Lite, and a serverless AWS architecture.</w:t>
+        <w:t>SlashMyBill is an AI-powered AWS FinOps platform with multi-account support, a BI-grade dashboard with 7 widgets, Finout-style virtual tagging with business unit allocation and shared cost splitting, a self-improving learning cycle with tip scoring, CloudWatch-based rightsizing, region-aware pricing, and 72 optimization tips with automated checks.</w:t>
       </w:r>
     </w:p>
     <w:p>
@@ -242,7 +242,7 @@
         <w:rPr>
           <w:color w:val="1A56DB"/>
         </w:rPr>
-        <w:t>2. Architecture Overview</w:t>
+        <w:t>2. Architecture</w:t>
       </w:r>
     </w:p>
     <w:p>
@@ -357,7 +357,7 @@
               <w:rPr>
                 <w:sz w:val="20"/>
               </w:rPr>
-              <w:t>FinOps Dashboard</w:t>
+              <w:t>Dashboard</w:t>
             </w:r>
           </w:p>
         </w:tc>
@@ -384,6 +384,47 @@
                 <w:sz w:val="20"/>
               </w:rPr>
               <w:t>KPIs, treemap, trends, rightsizing, waste, allocation</w:t>
+            </w:r>
+          </w:p>
+        </w:tc>
+      </w:tr>
+      <w:tr>
+        <w:tc>
+          <w:tcPr>
+            <w:tcW w:type="dxa" w:w="3135"/>
+          </w:tcPr>
+          <w:p>
+            <w:r>
+              <w:rPr>
+                <w:sz w:val="20"/>
+              </w:rPr>
+              <w:t>Virtual Tagging</w:t>
+            </w:r>
+          </w:p>
+        </w:tc>
+        <w:tc>
+          <w:tcPr>
+            <w:tcW w:type="dxa" w:w="3135"/>
+          </w:tcPr>
+          <w:p>
+            <w:r>
+              <w:rPr>
+                <w:sz w:val="20"/>
+              </w:rPr>
+              <w:t>Rule engine + Treemap</w:t>
+            </w:r>
+          </w:p>
+        </w:tc>
+        <w:tc>
+          <w:tcPr>
+            <w:tcW w:type="dxa" w:w="3135"/>
+          </w:tcPr>
+          <w:p>
+            <w:r>
+              <w:rPr>
+                <w:sz w:val="20"/>
+              </w:rPr>
+              <w:t>Business units, shared cost splitting, AI integration</w:t>
             </w:r>
           </w:p>
         </w:tc>
@@ -465,7 +506,7 @@
               <w:rPr>
                 <w:sz w:val="20"/>
               </w:rPr>
-              <w:t>Request routing to 7 Lambda functions</w:t>
+              <w:t>Request routing to 7 Lambdas</w:t>
             </w:r>
           </w:p>
         </w:tc>
@@ -493,7 +534,7 @@
               <w:rPr>
                 <w:sz w:val="20"/>
               </w:rPr>
-              <w:t>Python 3.12 (256 MB, 120s)</w:t>
+              <w:t>Python 3.12 (256 MB)</w:t>
             </w:r>
           </w:p>
         </w:tc>
@@ -506,7 +547,7 @@
               <w:rPr>
                 <w:sz w:val="20"/>
               </w:rPr>
-              <w:t>AI queries, dashboard data, allocation rules, feedback</w:t>
+              <w:t>AI, dashboard, allocation, feedback</w:t>
             </w:r>
           </w:p>
         </w:tc>
@@ -547,7 +588,7 @@
               <w:rPr>
                 <w:sz w:val="20"/>
               </w:rPr>
-              <w:t>30+ prompt rules, multi-account analysis</w:t>
+              <w:t>30+ rules, BU-aware queries</w:t>
             </w:r>
           </w:p>
         </w:tc>
@@ -588,48 +629,7 @@
               <w:rPr>
                 <w:sz w:val="20"/>
               </w:rPr>
-              <w:t>Members (+allocationRules), accounts (+sortOrder), tips (+scoring), feedback</w:t>
-            </w:r>
-          </w:p>
-        </w:tc>
-      </w:tr>
-      <w:tr>
-        <w:tc>
-          <w:tcPr>
-            <w:tcW w:type="dxa" w:w="3135"/>
-          </w:tcPr>
-          <w:p>
-            <w:r>
-              <w:rPr>
-                <w:sz w:val="20"/>
-              </w:rPr>
-              <w:t>CI/CD</w:t>
-            </w:r>
-          </w:p>
-        </w:tc>
-        <w:tc>
-          <w:tcPr>
-            <w:tcW w:type="dxa" w:w="3135"/>
-          </w:tcPr>
-          <w:p>
-            <w:r>
-              <w:rPr>
-                <w:sz w:val="20"/>
-              </w:rPr>
-              <w:t>GitHub Actions + OIDC</w:t>
-            </w:r>
-          </w:p>
-        </w:tc>
-        <w:tc>
-          <w:tcPr>
-            <w:tcW w:type="dxa" w:w="3135"/>
-          </w:tcPr>
-          <w:p>
-            <w:r>
-              <w:rPr>
-                <w:sz w:val="20"/>
-              </w:rPr>
-              <w:t>Auto-deploy on push to main</w:t>
+              <w:t>Members (+allocationRules), accounts (+sortOrder), tips (+scoring)</w:t>
             </w:r>
           </w:p>
         </w:tc>
@@ -656,7 +656,7 @@
         <w:pStyle w:val="ListBullet"/>
       </w:pPr>
       <w:r>
-        <w:t>Account priority ordering with ▲▼ buttons (sortOrder in DynamoDB)</w:t>
+        <w:t>Account priority with ▲▼ buttons (sortOrder in DynamoDB)</w:t>
       </w:r>
     </w:p>
     <w:p>
@@ -664,15 +664,7 @@
         <w:pStyle w:val="ListBullet"/>
       </w:pPr>
       <w:r>
-        <w:t>Vertical dropdown with checkboxes for multi-account selection</w:t>
-      </w:r>
-    </w:p>
-    <w:p>
-      <w:pPr>
-        <w:pStyle w:val="ListBullet"/>
-      </w:pPr>
-      <w:r>
-        <w:t>First (highest priority) account auto-checked by default</w:t>
+        <w:t>Vertical dropdown with checkboxes, first account auto-checked</w:t>
       </w:r>
     </w:p>
     <w:p>
@@ -688,7 +680,7 @@
         <w:pStyle w:val="ListBullet"/>
       </w:pPr>
       <w:r>
-        <w:t>Dashboard gathers data from all selected accounts in parallel</w:t>
+        <w:t>Dashboard gathers from all selected accounts in parallel (up to 5)</w:t>
       </w:r>
     </w:p>
     <w:p>
@@ -705,73 +697,6 @@
           <w:color w:val="1A56DB"/>
         </w:rPr>
         <w:t>4. FinOps Dashboard (7 Widgets)</w:t>
-      </w:r>
-    </w:p>
-    <w:p>
-      <w:r>
-        <w:t>The Dashboard tab provides a comprehensive BI layer with real-time data from all selected accounts.</w:t>
-      </w:r>
-    </w:p>
-    <w:p>
-      <w:pPr>
-        <w:pStyle w:val="Heading2"/>
-      </w:pPr>
-      <w:r>
-        <w:rPr>
-          <w:color w:val="1A56DB"/>
-        </w:rPr>
-        <w:t>4.1 KPI Summary Bar</w:t>
-      </w:r>
-    </w:p>
-    <w:p>
-      <w:pPr>
-        <w:pStyle w:val="ListBullet"/>
-      </w:pPr>
-      <w:r>
-        <w:t>Total Spend (current period) with dollar amount</w:t>
-      </w:r>
-    </w:p>
-    <w:p>
-      <w:pPr>
-        <w:pStyle w:val="ListBullet"/>
-      </w:pPr>
-      <w:r>
-        <w:t>Month-over-Month Change (green ▼ / red ▲ with percentage)</w:t>
-      </w:r>
-    </w:p>
-    <w:p>
-      <w:pPr>
-        <w:pStyle w:val="ListBullet"/>
-      </w:pPr>
-      <w:r>
-        <w:t>Cost Efficiency Score (0-100% with rating)</w:t>
-      </w:r>
-    </w:p>
-    <w:p>
-      <w:pPr>
-        <w:pStyle w:val="ListBullet"/>
-      </w:pPr>
-      <w:r>
-        <w:t>Potential Savings (dollar amount)</w:t>
-      </w:r>
-    </w:p>
-    <w:p>
-      <w:pPr>
-        <w:pStyle w:val="ListBullet"/>
-      </w:pPr>
-      <w:r>
-        <w:t>Accounts analyzed count</w:t>
-      </w:r>
-    </w:p>
-    <w:p>
-      <w:pPr>
-        <w:pStyle w:val="Heading2"/>
-      </w:pPr>
-      <w:r>
-        <w:rPr>
-          <w:color w:val="1A56DB"/>
-        </w:rPr>
-        <w:t>4.2 Dashboard Widgets (CSS Grid, 2-column)</w:t>
       </w:r>
     </w:p>
     <w:tbl>
@@ -811,7 +736,7 @@
                 <w:b/>
                 <w:sz w:val="20"/>
               </w:rPr>
-              <w:t>Chart Type</w:t>
+              <w:t>Type</w:t>
             </w:r>
           </w:p>
         </w:tc>
@@ -825,7 +750,48 @@
                 <w:b/>
                 <w:sz w:val="20"/>
               </w:rPr>
-              <w:t>Data Source</w:t>
+              <w:t>Data</w:t>
+            </w:r>
+          </w:p>
+        </w:tc>
+      </w:tr>
+      <w:tr>
+        <w:tc>
+          <w:tcPr>
+            <w:tcW w:type="dxa" w:w="3135"/>
+          </w:tcPr>
+          <w:p>
+            <w:r>
+              <w:rPr>
+                <w:sz w:val="20"/>
+              </w:rPr>
+              <w:t>KPI Bar</w:t>
+            </w:r>
+          </w:p>
+        </w:tc>
+        <w:tc>
+          <w:tcPr>
+            <w:tcW w:type="dxa" w:w="3135"/>
+          </w:tcPr>
+          <w:p>
+            <w:r>
+              <w:rPr>
+                <w:sz w:val="20"/>
+              </w:rPr>
+              <w:t>HTML Cards</w:t>
+            </w:r>
+          </w:p>
+        </w:tc>
+        <w:tc>
+          <w:tcPr>
+            <w:tcW w:type="dxa" w:w="3135"/>
+          </w:tcPr>
+          <w:p>
+            <w:r>
+              <w:rPr>
+                <w:sz w:val="20"/>
+              </w:rPr>
+              <w:t>Total Spend, MoM Change, Efficiency, Savings, Accounts</w:t>
             </w:r>
           </w:p>
         </w:tc>
@@ -866,7 +832,7 @@
               <w:rPr>
                 <w:sz w:val="20"/>
               </w:rPr>
-              <w:t>Proportional blocks by service cost, click to drill down</w:t>
+              <w:t>Proportional blocks, click to drill down</w:t>
             </w:r>
           </w:p>
         </w:tc>
@@ -881,7 +847,7 @@
               <w:rPr>
                 <w:sz w:val="20"/>
               </w:rPr>
-              <w:t>Daily Cost Trend</w:t>
+              <w:t>Daily Trend</w:t>
             </w:r>
           </w:p>
         </w:tc>
@@ -894,7 +860,7 @@
               <w:rPr>
                 <w:sz w:val="20"/>
               </w:rPr>
-              <w:t>ECharts Line + Anomaly Markers</w:t>
+              <w:t>ECharts Line</w:t>
             </w:r>
           </w:p>
         </w:tc>
@@ -907,7 +873,7 @@
               <w:rPr>
                 <w:sz w:val="20"/>
               </w:rPr>
-              <w:t>30-day daily costs, red ⚠️ on spikes &gt;2x average</w:t>
+              <w:t>30d with red ⚠️ anomaly markers</w:t>
             </w:r>
           </w:p>
         </w:tc>
@@ -948,7 +914,7 @@
               <w:rPr>
                 <w:sz w:val="20"/>
               </w:rPr>
-              <w:t>Business units from virtual tagging rules</w:t>
+              <w:t>Business units from virtual tagging</w:t>
             </w:r>
           </w:p>
         </w:tc>
@@ -976,7 +942,7 @@
               <w:rPr>
                 <w:sz w:val="20"/>
               </w:rPr>
-              <w:t>HTML List + Total</w:t>
+              <w:t>HTML List</w:t>
             </w:r>
           </w:p>
         </w:tc>
@@ -989,7 +955,7 @@
               <w:rPr>
                 <w:sz w:val="20"/>
               </w:rPr>
-              <w:t>Itemized waste: idle EBS, EIPs, KMS, VPC endpoints</w:t>
+              <w:t>Itemized waste + total amount</w:t>
             </w:r>
           </w:p>
         </w:tc>
@@ -1004,7 +970,7 @@
               <w:rPr>
                 <w:sz w:val="20"/>
               </w:rPr>
-              <w:t>Rightsizing Summary</w:t>
+              <w:t>Rightsizing</w:t>
             </w:r>
           </w:p>
         </w:tc>
@@ -1017,7 +983,7 @@
               <w:rPr>
                 <w:sz w:val="20"/>
               </w:rPr>
-              <w:t>HTML Cards + List</w:t>
+              <w:t>HTML Cards</w:t>
             </w:r>
           </w:p>
         </w:tc>
@@ -1030,7 +996,7 @@
               <w:rPr>
                 <w:sz w:val="20"/>
               </w:rPr>
-              <w:t>Over-provisioned count + top opportunities with savings</w:t>
+              <w:t>Over-provisioned count + top opportunities</w:t>
             </w:r>
           </w:p>
         </w:tc>
@@ -1071,7 +1037,7 @@
               <w:rPr>
                 <w:sz w:val="20"/>
               </w:rPr>
-              <w:t>Month-over-month totals with readable labels</w:t>
+              <w:t>Month labels, multi-account aggregate</w:t>
             </w:r>
           </w:p>
         </w:tc>
@@ -1099,7 +1065,7 @@
               <w:rPr>
                 <w:sz w:val="20"/>
               </w:rPr>
-              <w:t>ECharts Horizontal Bar</w:t>
+              <w:t>ECharts H-Bar</w:t>
             </w:r>
           </w:p>
         </w:tc>
@@ -1112,55 +1078,12 @@
               <w:rPr>
                 <w:sz w:val="20"/>
               </w:rPr>
-              <w:t>Spend per account for multi-account view</w:t>
+              <w:t>Spend per account</w:t>
             </w:r>
           </w:p>
         </w:tc>
       </w:tr>
     </w:tbl>
-    <w:p>
-      <w:pPr>
-        <w:pStyle w:val="Heading2"/>
-      </w:pPr>
-      <w:r>
-        <w:rPr>
-          <w:color w:val="1A56DB"/>
-        </w:rPr>
-        <w:t>4.3 Dashboard Data Flow</w:t>
-      </w:r>
-    </w:p>
-    <w:p>
-      <w:pPr>
-        <w:pStyle w:val="ListBullet"/>
-      </w:pPr>
-      <w:r>
-        <w:t>User clicks Dashboard tab → populateDashAccounts() + loadDashboardData()</w:t>
-      </w:r>
-    </w:p>
-    <w:p>
-      <w:pPr>
-        <w:pStyle w:val="ListBullet"/>
-      </w:pPr>
-      <w:r>
-        <w:t>GET /members/dashboard-data?accountIds=... fetches from all selected accounts</w:t>
-      </w:r>
-    </w:p>
-    <w:p>
-      <w:pPr>
-        <w:pStyle w:val="ListBullet"/>
-      </w:pPr>
-      <w:r>
-        <w:t>Backend: STS AssumeRole per account → 20+ API calls → merge → apply allocation rules</w:t>
-      </w:r>
-    </w:p>
-    <w:p>
-      <w:pPr>
-        <w:pStyle w:val="ListBullet"/>
-      </w:pPr>
-      <w:r>
-        <w:t>5-minute client-side cache, Refresh button to force reload</w:t>
-      </w:r>
-    </w:p>
     <w:p>
       <w:r>
         <w:br w:type="page"/>
@@ -1174,12 +1097,12 @@
         <w:rPr>
           <w:color w:val="1A56DB"/>
         </w:rPr>
-        <w:t>5. Cost Allocation &amp; Virtual Tagging</w:t>
+        <w:t>5. Virtual Tagging &amp; Cost Allocation</w:t>
       </w:r>
     </w:p>
     <w:p>
       <w:r>
-        <w:t>Inspired by Finout, SlashMyBill provides a rules engine to allocate costs to business units without requiring engineering teams to rework AWS tags. Rules are stored per member in DynamoDB.</w:t>
+        <w:t>Inspired by Finout and AWS Cost Categories, SlashMyBill provides a user-friendly virtual tagging system that allocates costs to business units without requiring engineering teams to rework AWS tags.</w:t>
       </w:r>
     </w:p>
     <w:p>
@@ -1190,7 +1113,65 @@
         <w:rPr>
           <w:color w:val="1A56DB"/>
         </w:rPr>
-        <w:t>5.1 Rule Types</w:t>
+        <w:t>5.1 Business Unit Definition</w:t>
+      </w:r>
+    </w:p>
+    <w:p>
+      <w:r>
+        <w:t>Users define business units through an "If-This-Then-That" visual rule builder:</w:t>
+      </w:r>
+    </w:p>
+    <w:p>
+      <w:pPr>
+        <w:pStyle w:val="ListBullet"/>
+      </w:pPr>
+      <w:r>
+        <w:rPr>
+          <w:b/>
+        </w:rPr>
+        <w:t xml:space="preserve">Step 1: </w:t>
+      </w:r>
+      <w:r>
+        <w:t>Name the unit (e.g., "Data Science Team")</w:t>
+      </w:r>
+    </w:p>
+    <w:p>
+      <w:pPr>
+        <w:pStyle w:val="ListBullet"/>
+      </w:pPr>
+      <w:r>
+        <w:rPr>
+          <w:b/>
+        </w:rPr>
+        <w:t xml:space="preserve">Step 2: </w:t>
+      </w:r>
+      <w:r>
+        <w:t>Add rules: IF Account ID equals X, OR Service contains "SageMaker", OR Tag contains "data-prod"</w:t>
+      </w:r>
+    </w:p>
+    <w:p>
+      <w:pPr>
+        <w:pStyle w:val="ListBullet"/>
+      </w:pPr>
+      <w:r>
+        <w:rPr>
+          <w:b/>
+        </w:rPr>
+        <w:t xml:space="preserve">Step 3: </w:t>
+      </w:r>
+      <w:r>
+        <w:t>Multiple OR conditions per business unit, up to 10 rules per BU, 20 BUs max</w:t>
+      </w:r>
+    </w:p>
+    <w:p>
+      <w:pPr>
+        <w:pStyle w:val="Heading2"/>
+      </w:pPr>
+      <w:r>
+        <w:rPr>
+          <w:color w:val="1A56DB"/>
+        </w:rPr>
+        <w:t>5.2 Rule Dimensions &amp; Operators</w:t>
       </w:r>
     </w:p>
     <w:tbl>
@@ -1216,7 +1197,21 @@
                 <w:b/>
                 <w:sz w:val="20"/>
               </w:rPr>
-              <w:t>Match Type</w:t>
+              <w:t>Dimension</w:t>
+            </w:r>
+          </w:p>
+        </w:tc>
+        <w:tc>
+          <w:tcPr>
+            <w:tcW w:type="dxa" w:w="3135"/>
+          </w:tcPr>
+          <w:p>
+            <w:r>
+              <w:rPr>
+                <w:b/>
+                <w:sz w:val="20"/>
+              </w:rPr>
+              <w:t>Operators</w:t>
             </w:r>
           </w:p>
         </w:tc>
@@ -1234,20 +1229,6 @@
             </w:r>
           </w:p>
         </w:tc>
-        <w:tc>
-          <w:tcPr>
-            <w:tcW w:type="dxa" w:w="3135"/>
-          </w:tcPr>
-          <w:p>
-            <w:r>
-              <w:rPr>
-                <w:b/>
-                <w:sz w:val="20"/>
-              </w:rPr>
-              <w:t>Effect</w:t>
-            </w:r>
-          </w:p>
-        </w:tc>
       </w:tr>
       <w:tr>
         <w:tc>
@@ -1259,7 +1240,7 @@
               <w:rPr>
                 <w:sz w:val="20"/>
               </w:rPr>
-              <w:t>Account</w:t>
+              <w:t>Account ID</w:t>
             </w:r>
           </w:p>
         </w:tc>
@@ -1272,7 +1253,7 @@
               <w:rPr>
                 <w:sz w:val="20"/>
               </w:rPr>
-              <w:t>991105135552</w:t>
+              <w:t>equals</w:t>
             </w:r>
           </w:p>
         </w:tc>
@@ -1285,7 +1266,7 @@
               <w:rPr>
                 <w:sz w:val="20"/>
               </w:rPr>
-              <w:t>Entire account mapped to "Production" business unit</w:t>
+              <w:t>991105135552 → "Production"</w:t>
             </w:r>
           </w:p>
         </w:tc>
@@ -1313,7 +1294,7 @@
               <w:rPr>
                 <w:sz w:val="20"/>
               </w:rPr>
-              <w:t>rds</w:t>
+              <w:t>equals, contains, startsWith</w:t>
             </w:r>
           </w:p>
         </w:tc>
@@ -1326,7 +1307,7 @@
               <w:rPr>
                 <w:sz w:val="20"/>
               </w:rPr>
-              <w:t>All RDS costs mapped to "Database Team"</w:t>
+              <w:t>"rds" → "Database Team"</w:t>
             </w:r>
           </w:p>
         </w:tc>
@@ -1354,7 +1335,7 @@
               <w:rPr>
                 <w:sz w:val="20"/>
               </w:rPr>
-              <w:t>Environment=prod</w:t>
+              <w:t>contains</w:t>
             </w:r>
           </w:p>
         </w:tc>
@@ -1367,7 +1348,356 @@
               <w:rPr>
                 <w:sz w:val="20"/>
               </w:rPr>
-              <w:t>Resources with this tag mapped to "Production"</w:t>
+              <w:t>Tag "Env:data-prod" → "Data Science"</w:t>
+            </w:r>
+          </w:p>
+        </w:tc>
+      </w:tr>
+    </w:tbl>
+    <w:p>
+      <w:pPr>
+        <w:pStyle w:val="Heading2"/>
+      </w:pPr>
+      <w:r>
+        <w:rPr>
+          <w:color w:val="1A56DB"/>
+        </w:rPr>
+        <w:t>5.3 Shared Cost Splitting</w:t>
+      </w:r>
+    </w:p>
+    <w:p>
+      <w:r>
+        <w:t>For untaggable costs (enterprise support, shared networking, Kubernetes clusters):</w:t>
+      </w:r>
+    </w:p>
+    <w:tbl>
+      <w:tblPr>
+        <w:tblStyle w:val="LightGrid-Accent1"/>
+        <w:tblW w:type="auto" w:w="0"/>
+        <w:jc w:val="left"/>
+        <w:tblLook w:firstColumn="1" w:firstRow="1" w:lastColumn="0" w:lastRow="0" w:noHBand="0" w:noVBand="1" w:val="04A0"/>
+      </w:tblPr>
+      <w:tblGrid>
+        <w:gridCol w:w="4703"/>
+        <w:gridCol w:w="4703"/>
+      </w:tblGrid>
+      <w:tr>
+        <w:tc>
+          <w:tcPr>
+            <w:tcW w:type="dxa" w:w="4703"/>
+          </w:tcPr>
+          <w:p>
+            <w:r>
+              <w:rPr>
+                <w:b/>
+                <w:sz w:val="20"/>
+              </w:rPr>
+              <w:t>Mode</w:t>
+            </w:r>
+          </w:p>
+        </w:tc>
+        <w:tc>
+          <w:tcPr>
+            <w:tcW w:type="dxa" w:w="4703"/>
+          </w:tcPr>
+          <w:p>
+            <w:r>
+              <w:rPr>
+                <w:b/>
+                <w:sz w:val="20"/>
+              </w:rPr>
+              <w:t>How It Works</w:t>
+            </w:r>
+          </w:p>
+        </w:tc>
+      </w:tr>
+      <w:tr>
+        <w:tc>
+          <w:tcPr>
+            <w:tcW w:type="dxa" w:w="4703"/>
+          </w:tcPr>
+          <w:p>
+            <w:r>
+              <w:rPr>
+                <w:sz w:val="20"/>
+              </w:rPr>
+              <w:t>Even</w:t>
+            </w:r>
+          </w:p>
+        </w:tc>
+        <w:tc>
+          <w:tcPr>
+            <w:tcW w:type="dxa" w:w="4703"/>
+          </w:tcPr>
+          <w:p>
+            <w:r>
+              <w:rPr>
+                <w:sz w:val="20"/>
+              </w:rPr>
+              <w:t>Divides cost equally among all defined business units</w:t>
+            </w:r>
+          </w:p>
+        </w:tc>
+      </w:tr>
+      <w:tr>
+        <w:tc>
+          <w:tcPr>
+            <w:tcW w:type="dxa" w:w="4703"/>
+          </w:tcPr>
+          <w:p>
+            <w:r>
+              <w:rPr>
+                <w:sz w:val="20"/>
+              </w:rPr>
+              <w:t>Proportional</w:t>
+            </w:r>
+          </w:p>
+        </w:tc>
+        <w:tc>
+          <w:tcPr>
+            <w:tcW w:type="dxa" w:w="4703"/>
+          </w:tcPr>
+          <w:p>
+            <w:r>
+              <w:rPr>
+                <w:sz w:val="20"/>
+              </w:rPr>
+              <w:t>Divides based on each BU's existing spend ratio (default)</w:t>
+            </w:r>
+          </w:p>
+        </w:tc>
+      </w:tr>
+      <w:tr>
+        <w:tc>
+          <w:tcPr>
+            <w:tcW w:type="dxa" w:w="4703"/>
+          </w:tcPr>
+          <w:p>
+            <w:r>
+              <w:rPr>
+                <w:sz w:val="20"/>
+              </w:rPr>
+              <w:t>Custom Percentage</w:t>
+            </w:r>
+          </w:p>
+        </w:tc>
+        <w:tc>
+          <w:tcPr>
+            <w:tcW w:type="dxa" w:w="4703"/>
+          </w:tcPr>
+          <w:p>
+            <w:r>
+              <w:rPr>
+                <w:sz w:val="20"/>
+              </w:rPr>
+              <w:t>User sets manual % per BU (e.g., 80% Prod, 20% Dev)</w:t>
+            </w:r>
+          </w:p>
+        </w:tc>
+      </w:tr>
+    </w:tbl>
+    <w:p>
+      <w:pPr>
+        <w:pStyle w:val="Heading2"/>
+      </w:pPr>
+      <w:r>
+        <w:rPr>
+          <w:color w:val="1A56DB"/>
+        </w:rPr>
+        <w:t>5.4 Processing Status &amp; Transparency</w:t>
+      </w:r>
+    </w:p>
+    <w:p>
+      <w:pPr>
+        <w:pStyle w:val="ListBullet"/>
+      </w:pPr>
+      <w:r>
+        <w:t>On save: status = "processing", yellow banner: "Rules saved! Dashboard will reflect within 24 hours."</w:t>
+      </w:r>
+    </w:p>
+    <w:p>
+      <w:pPr>
+        <w:pStyle w:val="ListBullet"/>
+      </w:pPr>
+      <w:r>
+        <w:t>After 24h: status transitions to "active"</w:t>
+      </w:r>
+    </w:p>
+    <w:p>
+      <w:pPr>
+        <w:pStyle w:val="ListBullet"/>
+      </w:pPr>
+      <w:r>
+        <w:t>Allocation % indicator: green ≥90%, yellow ≥70%, red &lt;70%</w:t>
+      </w:r>
+    </w:p>
+    <w:p>
+      <w:pPr>
+        <w:pStyle w:val="ListBullet"/>
+      </w:pPr>
+      <w:r>
+        <w:t>Target: mature FinOps organizations allocate &gt;90% of costs to owners</w:t>
+      </w:r>
+    </w:p>
+    <w:p>
+      <w:pPr>
+        <w:pStyle w:val="Heading2"/>
+      </w:pPr>
+      <w:r>
+        <w:rPr>
+          <w:color w:val="1A56DB"/>
+        </w:rPr>
+        <w:t>5.5 AI Agent Integration</w:t>
+      </w:r>
+    </w:p>
+    <w:p>
+      <w:r>
+        <w:t>When a user asks "Why did the Data Science team's cost spike?":</w:t>
+      </w:r>
+    </w:p>
+    <w:p>
+      <w:pPr>
+        <w:pStyle w:val="ListBullet"/>
+      </w:pPr>
+      <w:r>
+        <w:t>AI checks allocationRules in the member's DynamoDB record</w:t>
+      </w:r>
+    </w:p>
+    <w:p>
+      <w:pPr>
+        <w:pStyle w:val="ListBullet"/>
+      </w:pPr>
+      <w:r>
+        <w:t>Maps "Data Science" to the business unit's rules</w:t>
+      </w:r>
+    </w:p>
+    <w:p>
+      <w:pPr>
+        <w:pStyle w:val="ListBullet"/>
+      </w:pPr>
+      <w:r>
+        <w:t>Filters cost data by the matched accounts/services/tags</w:t>
+      </w:r>
+    </w:p>
+    <w:p>
+      <w:pPr>
+        <w:pStyle w:val="ListBullet"/>
+      </w:pPr>
+      <w:r>
+        <w:t>Delivers contextual answer without the user writing custom queries</w:t>
+      </w:r>
+    </w:p>
+    <w:p>
+      <w:pPr>
+        <w:pStyle w:val="Heading2"/>
+      </w:pPr>
+      <w:r>
+        <w:rPr>
+          <w:color w:val="1A56DB"/>
+        </w:rPr>
+        <w:t>5.6 Dashboard Visualization</w:t>
+      </w:r>
+    </w:p>
+    <w:p>
+      <w:pPr>
+        <w:pStyle w:val="ListBullet"/>
+      </w:pPr>
+      <w:r>
+        <w:t>ECharts Treemap shows proportional cost per business unit</w:t>
+      </w:r>
+    </w:p>
+    <w:p>
+      <w:pPr>
+        <w:pStyle w:val="ListBullet"/>
+      </w:pPr>
+      <w:r>
+        <w:t>"Manage Rules" button opens the If-This-Then-That rule builder modal</w:t>
+      </w:r>
+    </w:p>
+    <w:p>
+      <w:pPr>
+        <w:pStyle w:val="ListBullet"/>
+      </w:pPr>
+      <w:r>
+        <w:t>Shared cost mode displayed alongside allocation percentage</w:t>
+      </w:r>
+    </w:p>
+    <w:p>
+      <w:pPr>
+        <w:pStyle w:val="ListBullet"/>
+      </w:pPr>
+      <w:r>
+        <w:t>Unallocated spend highlighted to drive accountability</w:t>
+      </w:r>
+    </w:p>
+    <w:p>
+      <w:pPr>
+        <w:pStyle w:val="Heading2"/>
+      </w:pPr>
+      <w:r>
+        <w:rPr>
+          <w:color w:val="1A56DB"/>
+        </w:rPr>
+        <w:t>5.7 Data Model</w:t>
+      </w:r>
+    </w:p>
+    <w:p>
+      <w:r>
+        <w:t>Stored in MemberPortal-Members table as allocationRules field:</w:t>
+      </w:r>
+    </w:p>
+    <w:tbl>
+      <w:tblPr>
+        <w:tblStyle w:val="LightGrid-Accent1"/>
+        <w:tblW w:type="auto" w:w="0"/>
+        <w:jc w:val="left"/>
+        <w:tblLook w:firstColumn="1" w:firstRow="1" w:lastColumn="0" w:lastRow="0" w:noHBand="0" w:noVBand="1" w:val="04A0"/>
+      </w:tblPr>
+      <w:tblGrid>
+        <w:gridCol w:w="3135"/>
+        <w:gridCol w:w="3135"/>
+        <w:gridCol w:w="3135"/>
+      </w:tblGrid>
+      <w:tr>
+        <w:tc>
+          <w:tcPr>
+            <w:tcW w:type="dxa" w:w="3135"/>
+          </w:tcPr>
+          <w:p>
+            <w:r>
+              <w:rPr>
+                <w:b/>
+                <w:sz w:val="20"/>
+              </w:rPr>
+              <w:t>Field</w:t>
+            </w:r>
+          </w:p>
+        </w:tc>
+        <w:tc>
+          <w:tcPr>
+            <w:tcW w:type="dxa" w:w="3135"/>
+          </w:tcPr>
+          <w:p>
+            <w:r>
+              <w:rPr>
+                <w:b/>
+                <w:sz w:val="20"/>
+              </w:rPr>
+              <w:t>Type</w:t>
+            </w:r>
+          </w:p>
+        </w:tc>
+        <w:tc>
+          <w:tcPr>
+            <w:tcW w:type="dxa" w:w="3135"/>
+          </w:tcPr>
+          <w:p>
+            <w:r>
+              <w:rPr>
+                <w:b/>
+                <w:sz w:val="20"/>
+              </w:rPr>
+              <w:t>Description</w:t>
             </w:r>
           </w:p>
         </w:tc>
@@ -1382,7 +1712,7 @@
               <w:rPr>
                 <w:sz w:val="20"/>
               </w:rPr>
-              <w:t>Default</w:t>
+              <w:t>businessUnits</w:t>
             </w:r>
           </w:p>
         </w:tc>
@@ -1395,7 +1725,7 @@
               <w:rPr>
                 <w:sz w:val="20"/>
               </w:rPr>
-              <w:t>(catch-all)</w:t>
+              <w:t>Array</w:t>
             </w:r>
           </w:p>
         </w:tc>
@@ -1408,90 +1738,176 @@
               <w:rPr>
                 <w:sz w:val="20"/>
               </w:rPr>
-              <w:t>All unmatched costs mapped to "Unallocated"</w:t>
+              <w:t>List of {name, rules[{dimension, operator, value}]}</w:t>
+            </w:r>
+          </w:p>
+        </w:tc>
+      </w:tr>
+      <w:tr>
+        <w:tc>
+          <w:tcPr>
+            <w:tcW w:type="dxa" w:w="3135"/>
+          </w:tcPr>
+          <w:p>
+            <w:r>
+              <w:rPr>
+                <w:sz w:val="20"/>
+              </w:rPr>
+              <w:t>sharedCostMode</w:t>
+            </w:r>
+          </w:p>
+        </w:tc>
+        <w:tc>
+          <w:tcPr>
+            <w:tcW w:type="dxa" w:w="3135"/>
+          </w:tcPr>
+          <w:p>
+            <w:r>
+              <w:rPr>
+                <w:sz w:val="20"/>
+              </w:rPr>
+              <w:t>String</w:t>
+            </w:r>
+          </w:p>
+        </w:tc>
+        <w:tc>
+          <w:tcPr>
+            <w:tcW w:type="dxa" w:w="3135"/>
+          </w:tcPr>
+          <w:p>
+            <w:r>
+              <w:rPr>
+                <w:sz w:val="20"/>
+              </w:rPr>
+              <w:t>even | proportional | custom</w:t>
+            </w:r>
+          </w:p>
+        </w:tc>
+      </w:tr>
+      <w:tr>
+        <w:tc>
+          <w:tcPr>
+            <w:tcW w:type="dxa" w:w="3135"/>
+          </w:tcPr>
+          <w:p>
+            <w:r>
+              <w:rPr>
+                <w:sz w:val="20"/>
+              </w:rPr>
+              <w:t>customSplits</w:t>
+            </w:r>
+          </w:p>
+        </w:tc>
+        <w:tc>
+          <w:tcPr>
+            <w:tcW w:type="dxa" w:w="3135"/>
+          </w:tcPr>
+          <w:p>
+            <w:r>
+              <w:rPr>
+                <w:sz w:val="20"/>
+              </w:rPr>
+              <w:t>Object</w:t>
+            </w:r>
+          </w:p>
+        </w:tc>
+        <w:tc>
+          <w:tcPr>
+            <w:tcW w:type="dxa" w:w="3135"/>
+          </w:tcPr>
+          <w:p>
+            <w:r>
+              <w:rPr>
+                <w:sz w:val="20"/>
+              </w:rPr>
+              <w:t>{buName: percentage} for custom mode</w:t>
+            </w:r>
+          </w:p>
+        </w:tc>
+      </w:tr>
+      <w:tr>
+        <w:tc>
+          <w:tcPr>
+            <w:tcW w:type="dxa" w:w="3135"/>
+          </w:tcPr>
+          <w:p>
+            <w:r>
+              <w:rPr>
+                <w:sz w:val="20"/>
+              </w:rPr>
+              <w:t>status</w:t>
+            </w:r>
+          </w:p>
+        </w:tc>
+        <w:tc>
+          <w:tcPr>
+            <w:tcW w:type="dxa" w:w="3135"/>
+          </w:tcPr>
+          <w:p>
+            <w:r>
+              <w:rPr>
+                <w:sz w:val="20"/>
+              </w:rPr>
+              <w:t>String</w:t>
+            </w:r>
+          </w:p>
+        </w:tc>
+        <w:tc>
+          <w:tcPr>
+            <w:tcW w:type="dxa" w:w="3135"/>
+          </w:tcPr>
+          <w:p>
+            <w:r>
+              <w:rPr>
+                <w:sz w:val="20"/>
+              </w:rPr>
+              <w:t>processing | active</w:t>
+            </w:r>
+          </w:p>
+        </w:tc>
+      </w:tr>
+      <w:tr>
+        <w:tc>
+          <w:tcPr>
+            <w:tcW w:type="dxa" w:w="3135"/>
+          </w:tcPr>
+          <w:p>
+            <w:r>
+              <w:rPr>
+                <w:sz w:val="20"/>
+              </w:rPr>
+              <w:t>updatedAt</w:t>
+            </w:r>
+          </w:p>
+        </w:tc>
+        <w:tc>
+          <w:tcPr>
+            <w:tcW w:type="dxa" w:w="3135"/>
+          </w:tcPr>
+          <w:p>
+            <w:r>
+              <w:rPr>
+                <w:sz w:val="20"/>
+              </w:rPr>
+              <w:t>ISO 8601</w:t>
+            </w:r>
+          </w:p>
+        </w:tc>
+        <w:tc>
+          <w:tcPr>
+            <w:tcW w:type="dxa" w:w="3135"/>
+          </w:tcPr>
+          <w:p>
+            <w:r>
+              <w:rPr>
+                <w:sz w:val="20"/>
+              </w:rPr>
+              <w:t>Last update timestamp</w:t>
             </w:r>
           </w:p>
         </w:tc>
       </w:tr>
     </w:tbl>
-    <w:p>
-      <w:pPr>
-        <w:pStyle w:val="Heading2"/>
-      </w:pPr>
-      <w:r>
-        <w:rPr>
-          <w:color w:val="1A56DB"/>
-        </w:rPr>
-        <w:t>5.2 Allocation Metrics</w:t>
-      </w:r>
-    </w:p>
-    <w:p>
-      <w:pPr>
-        <w:pStyle w:val="ListBullet"/>
-      </w:pPr>
-      <w:r>
-        <w:t>allocatedPct: percentage of total spend mapped to business units (target: &gt;90%)</w:t>
-      </w:r>
-    </w:p>
-    <w:p>
-      <w:pPr>
-        <w:pStyle w:val="ListBullet"/>
-      </w:pPr>
-      <w:r>
-        <w:t>Unallocated spend highlighted to drive accountability</w:t>
-      </w:r>
-    </w:p>
-    <w:p>
-      <w:pPr>
-        <w:pStyle w:val="ListBullet"/>
-      </w:pPr>
-      <w:r>
-        <w:t>Treemap visualization shows proportional cost per business unit</w:t>
-      </w:r>
-    </w:p>
-    <w:p>
-      <w:pPr>
-        <w:pStyle w:val="Heading2"/>
-      </w:pPr>
-      <w:r>
-        <w:rPr>
-          <w:color w:val="1A56DB"/>
-        </w:rPr>
-        <w:t>5.3 Management UI</w:t>
-      </w:r>
-    </w:p>
-    <w:p>
-      <w:pPr>
-        <w:pStyle w:val="ListBullet"/>
-      </w:pPr>
-      <w:r>
-        <w:t>"Manage Rules" button in Dashboard opens modal for CRUD</w:t>
-      </w:r>
-    </w:p>
-    <w:p>
-      <w:pPr>
-        <w:pStyle w:val="ListBullet"/>
-      </w:pPr>
-      <w:r>
-        <w:t>Add/edit/delete rules with: name, matchType, matchValue, businessUnit</w:t>
-      </w:r>
-    </w:p>
-    <w:p>
-      <w:pPr>
-        <w:pStyle w:val="ListBullet"/>
-      </w:pPr>
-      <w:r>
-        <w:t>Saving rules auto-refreshes dashboard with new allocation view</w:t>
-      </w:r>
-    </w:p>
-    <w:p>
-      <w:pPr>
-        <w:pStyle w:val="ListBullet"/>
-      </w:pPr>
-      <w:r>
-        <w:t>Max 50 rules per member</w:t>
-      </w:r>
-    </w:p>
     <w:p>
       <w:r>
         <w:br w:type="page"/>
@@ -1505,7 +1921,7 @@
         <w:rPr>
           <w:color w:val="1A56DB"/>
         </w:rPr>
-        <w:t>6. AI Agent Data Flow</w:t>
+        <w:t>6. AI Agent</w:t>
       </w:r>
     </w:p>
     <w:p>
@@ -1519,7 +1935,7 @@
         <w:t xml:space="preserve">1. </w:t>
       </w:r>
       <w:r>
-        <w:t>JWT auth + multi-account selection</w:t>
+        <w:t>JWT auth + multi-account</w:t>
       </w:r>
     </w:p>
     <w:p>
@@ -1547,7 +1963,7 @@
         <w:t xml:space="preserve">3. </w:t>
       </w:r>
       <w:r>
-        <w:t>20+ APIs + CloudWatch per account</w:t>
+        <w:t>20+ APIs + CloudWatch</w:t>
       </w:r>
     </w:p>
     <w:p>
@@ -1575,7 +1991,7 @@
         <w:t xml:space="preserve">5. </w:t>
       </w:r>
       <w:r>
-        <w:t>Region-aware pricing (actual instances)</w:t>
+        <w:t>Region-aware pricing</w:t>
       </w:r>
     </w:p>
     <w:p>
@@ -1603,7 +2019,7 @@
         <w:t xml:space="preserve">7. </w:t>
       </w:r>
       <w:r>
-        <w:t>30+ prompt rules → Bedrock</w:t>
+        <w:t>30+ prompt rules + BU awareness → Bedrock</w:t>
       </w:r>
     </w:p>
     <w:p>
@@ -1631,7 +2047,7 @@
         <w:t xml:space="preserve">9. </w:t>
       </w:r>
       <w:r>
-        <w:t>Learning cycle: auto-save + feedback scoring</w:t>
+        <w:t>Learning: auto-save + scoring</w:t>
       </w:r>
     </w:p>
     <w:p>
@@ -1658,14 +2074,13 @@
         <w:tblLook w:firstColumn="1" w:firstRow="1" w:lastColumn="0" w:lastRow="0" w:noHBand="0" w:noVBand="1" w:val="04A0"/>
       </w:tblPr>
       <w:tblGrid>
-        <w:gridCol w:w="3135"/>
-        <w:gridCol w:w="3135"/>
-        <w:gridCol w:w="3135"/>
+        <w:gridCol w:w="4703"/>
+        <w:gridCol w:w="4703"/>
       </w:tblGrid>
       <w:tr>
         <w:tc>
           <w:tcPr>
-            <w:tcW w:type="dxa" w:w="3135"/>
+            <w:tcW w:type="dxa" w:w="4703"/>
           </w:tcPr>
           <w:p>
             <w:r>
@@ -1679,7 +2094,7 @@
         </w:tc>
         <w:tc>
           <w:tcPr>
-            <w:tcW w:type="dxa" w:w="3135"/>
+            <w:tcW w:type="dxa" w:w="4703"/>
           </w:tcPr>
           <w:p>
             <w:r>
@@ -1691,25 +2106,11 @@
             </w:r>
           </w:p>
         </w:tc>
-        <w:tc>
-          <w:tcPr>
-            <w:tcW w:type="dxa" w:w="3135"/>
-          </w:tcPr>
-          <w:p>
-            <w:r>
-              <w:rPr>
-                <w:b/>
-                <w:sz w:val="20"/>
-              </w:rPr>
-              <w:t>Data</w:t>
-            </w:r>
-          </w:p>
-        </w:tc>
       </w:tr>
       <w:tr>
         <w:tc>
           <w:tcPr>
-            <w:tcW w:type="dxa" w:w="3135"/>
+            <w:tcW w:type="dxa" w:w="4703"/>
           </w:tcPr>
           <w:p>
             <w:r>
@@ -1722,27 +2123,14 @@
         </w:tc>
         <w:tc>
           <w:tcPr>
-            <w:tcW w:type="dxa" w:w="3135"/>
+            <w:tcW w:type="dxa" w:w="4703"/>
           </w:tcPr>
           <w:p>
             <w:r>
               <w:rPr>
                 <w:sz w:val="20"/>
               </w:rPr>
-              <w:t>GetCostAndUsage (monthly, daily, usage type, monthly trend)</w:t>
-            </w:r>
-          </w:p>
-        </w:tc>
-        <w:tc>
-          <w:tcPr>
-            <w:tcW w:type="dxa" w:w="3135"/>
-          </w:tcPr>
-          <w:p>
-            <w:r>
-              <w:rPr>
-                <w:sz w:val="20"/>
-              </w:rPr>
-              <w:t>Cost by service, daily trend, VPC/EC2-Other breakdown, any-period comparison</w:t>
+              <w:t>GetCostAndUsage (monthly, daily, usage type, any-period trend)</w:t>
             </w:r>
           </w:p>
         </w:tc>
@@ -1750,7 +2138,7 @@
       <w:tr>
         <w:tc>
           <w:tcPr>
-            <w:tcW w:type="dxa" w:w="3135"/>
+            <w:tcW w:type="dxa" w:w="4703"/>
           </w:tcPr>
           <w:p>
             <w:r>
@@ -1763,27 +2151,14 @@
         </w:tc>
         <w:tc>
           <w:tcPr>
-            <w:tcW w:type="dxa" w:w="3135"/>
+            <w:tcW w:type="dxa" w:w="4703"/>
           </w:tcPr>
           <w:p>
             <w:r>
               <w:rPr>
                 <w:sz w:val="20"/>
               </w:rPr>
-              <w:t>DescribeInstances, NatGateways, Addresses, VpcEndpoints, Volumes</w:t>
-            </w:r>
-          </w:p>
-        </w:tc>
-        <w:tc>
-          <w:tcPr>
-            <w:tcW w:type="dxa" w:w="3135"/>
-          </w:tcPr>
-          <w:p>
-            <w:r>
-              <w:rPr>
-                <w:sz w:val="20"/>
-              </w:rPr>
-              <w:t>Instance types+tags, NAT GWs, idle EIPs, VPC endpoints, EBS volumes</w:t>
+              <w:t>DescribeInstances (+tags), NatGateways, Addresses, VpcEndpoints, Volumes</w:t>
             </w:r>
           </w:p>
         </w:tc>
@@ -1791,7 +2166,7 @@
       <w:tr>
         <w:tc>
           <w:tcPr>
-            <w:tcW w:type="dxa" w:w="3135"/>
+            <w:tcW w:type="dxa" w:w="4703"/>
           </w:tcPr>
           <w:p>
             <w:r>
@@ -1804,27 +2179,14 @@
         </w:tc>
         <w:tc>
           <w:tcPr>
-            <w:tcW w:type="dxa" w:w="3135"/>
+            <w:tcW w:type="dxa" w:w="4703"/>
           </w:tcPr>
           <w:p>
             <w:r>
               <w:rPr>
                 <w:sz w:val="20"/>
               </w:rPr>
-              <w:t>DescribeDBInstances</w:t>
-            </w:r>
-          </w:p>
-        </w:tc>
-        <w:tc>
-          <w:tcPr>
-            <w:tcW w:type="dxa" w:w="3135"/>
-          </w:tcPr>
-          <w:p>
-            <w:r>
-              <w:rPr>
-                <w:sz w:val="20"/>
-              </w:rPr>
-              <w:t>Instance class, engine, Multi-AZ, storage</w:t>
+              <w:t>DescribeDBInstances (class, engine, Multi-AZ)</w:t>
             </w:r>
           </w:p>
         </w:tc>
@@ -1832,7 +2194,7 @@
       <w:tr>
         <w:tc>
           <w:tcPr>
-            <w:tcW w:type="dxa" w:w="3135"/>
+            <w:tcW w:type="dxa" w:w="4703"/>
           </w:tcPr>
           <w:p>
             <w:r>
@@ -1845,27 +2207,14 @@
         </w:tc>
         <w:tc>
           <w:tcPr>
-            <w:tcW w:type="dxa" w:w="3135"/>
+            <w:tcW w:type="dxa" w:w="4703"/>
           </w:tcPr>
           <w:p>
             <w:r>
               <w:rPr>
                 <w:sz w:val="20"/>
               </w:rPr>
-              <w:t>ECS ListServices+DescribeServices, EKS ListClusters</w:t>
-            </w:r>
-          </w:p>
-        </w:tc>
-        <w:tc>
-          <w:tcPr>
-            <w:tcW w:type="dxa" w:w="3135"/>
-          </w:tcPr>
-          <w:p>
-            <w:r>
-              <w:rPr>
-                <w:sz w:val="20"/>
-              </w:rPr>
-              <w:t>Service CPU/memory, cluster inventory</w:t>
+              <w:t>ECS ListServices+CW metrics, EKS ListClusters</w:t>
             </w:r>
           </w:p>
         </w:tc>
@@ -1873,7 +2222,7 @@
       <w:tr>
         <w:tc>
           <w:tcPr>
-            <w:tcW w:type="dxa" w:w="3135"/>
+            <w:tcW w:type="dxa" w:w="4703"/>
           </w:tcPr>
           <w:p>
             <w:r>
@@ -1886,27 +2235,14 @@
         </w:tc>
         <w:tc>
           <w:tcPr>
-            <w:tcW w:type="dxa" w:w="3135"/>
+            <w:tcW w:type="dxa" w:w="4703"/>
           </w:tcPr>
           <w:p>
             <w:r>
               <w:rPr>
                 <w:sz w:val="20"/>
               </w:rPr>
-              <w:t>GetMetricStatistics (EC2 CPU+Memory+Network, RDS CPU+Connections+Memory+IOPS, ELB Requests, NAT GW Bytes, EBS IOPS)</w:t>
-            </w:r>
-          </w:p>
-        </w:tc>
-        <w:tc>
-          <w:tcPr>
-            <w:tcW w:type="dxa" w:w="3135"/>
-          </w:tcPr>
-          <w:p>
-            <w:r>
-              <w:rPr>
-                <w:sz w:val="20"/>
-              </w:rPr>
-              <w:t>30-day avg+peak for rightsizing</w:t>
+              <w:t>EC2 CPU+Memory+Network, RDS CPU+Connections+Memory+IOPS, ELB, NAT GW, EBS</w:t>
             </w:r>
           </w:p>
         </w:tc>
@@ -1914,7 +2250,7 @@
       <w:tr>
         <w:tc>
           <w:tcPr>
-            <w:tcW w:type="dxa" w:w="3135"/>
+            <w:tcW w:type="dxa" w:w="4703"/>
           </w:tcPr>
           <w:p>
             <w:r>
@@ -1927,27 +2263,14 @@
         </w:tc>
         <w:tc>
           <w:tcPr>
-            <w:tcW w:type="dxa" w:w="3135"/>
+            <w:tcW w:type="dxa" w:w="4703"/>
           </w:tcPr>
           <w:p>
             <w:r>
               <w:rPr>
                 <w:sz w:val="20"/>
               </w:rPr>
-              <w:t>GetEC2InstanceRecommendations</w:t>
-            </w:r>
-          </w:p>
-        </w:tc>
-        <w:tc>
-          <w:tcPr>
-            <w:tcW w:type="dxa" w:w="3135"/>
-          </w:tcPr>
-          <w:p>
-            <w:r>
-              <w:rPr>
-                <w:sz w:val="20"/>
-              </w:rPr>
-              <w:t>ML-based rightsizing (14+ days)</w:t>
+              <w:t>GetEC2InstanceRecommendations (ML 14+ days)</w:t>
             </w:r>
           </w:p>
         </w:tc>
@@ -1955,7 +2278,7 @@
       <w:tr>
         <w:tc>
           <w:tcPr>
-            <w:tcW w:type="dxa" w:w="3135"/>
+            <w:tcW w:type="dxa" w:w="4703"/>
           </w:tcPr>
           <w:p>
             <w:r>
@@ -1968,7 +2291,7 @@
         </w:tc>
         <w:tc>
           <w:tcPr>
-            <w:tcW w:type="dxa" w:w="3135"/>
+            <w:tcW w:type="dxa" w:w="4703"/>
           </w:tcPr>
           <w:p>
             <w:r>
@@ -1979,24 +2302,11 @@
             </w:r>
           </w:p>
         </w:tc>
-        <w:tc>
-          <w:tcPr>
-            <w:tcW w:type="dxa" w:w="3135"/>
-          </w:tcPr>
-          <w:p>
-            <w:r>
-              <w:rPr>
-                <w:sz w:val="20"/>
-              </w:rPr>
-              <w:t>On-Demand, SP, Spot, RI pricing</w:t>
-            </w:r>
-          </w:p>
-        </w:tc>
       </w:tr>
       <w:tr>
         <w:tc>
           <w:tcPr>
-            <w:tcW w:type="dxa" w:w="3135"/>
+            <w:tcW w:type="dxa" w:w="4703"/>
           </w:tcPr>
           <w:p>
             <w:r>
@@ -2009,27 +2319,14 @@
         </w:tc>
         <w:tc>
           <w:tcPr>
-            <w:tcW w:type="dxa" w:w="3135"/>
+            <w:tcW w:type="dxa" w:w="4703"/>
           </w:tcPr>
           <w:p>
             <w:r>
               <w:rPr>
                 <w:sz w:val="20"/>
               </w:rPr>
-              <w:t>KMS ListKeys, S3 Lifecycle+IntelligentTiering, Route53 ListHostedZones</w:t>
-            </w:r>
-          </w:p>
-        </w:tc>
-        <w:tc>
-          <w:tcPr>
-            <w:tcW w:type="dxa" w:w="3135"/>
-          </w:tcPr>
-          <w:p>
-            <w:r>
-              <w:rPr>
-                <w:sz w:val="20"/>
-              </w:rPr>
-              <w:t>KMS keys, S3 optimization, DNS zones</w:t>
+              <w:t>KMS, S3 Lifecycle+IT, Route53</w:t>
             </w:r>
           </w:p>
         </w:tc>
@@ -2143,7 +2440,7 @@
               <w:rPr>
                 <w:sz w:val="20"/>
               </w:rPr>
-              <w:t>CO ML &gt; CW &gt; static. Memory guard rail. Graviton. Scheduling.</w:t>
+              <w:t>CO ML &gt; CW &gt; static. Memory guard. Graviton. Scheduling.</w:t>
             </w:r>
           </w:p>
         </w:tc>
@@ -2184,7 +2481,7 @@
               <w:rPr>
                 <w:sz w:val="20"/>
               </w:rPr>
-              <w:t>Low CPU+high memory = downsize. High CPU = upsize.</w:t>
+              <w:t>Low CPU+high mem = downsize. High CPU = upsize.</w:t>
             </w:r>
           </w:p>
         </w:tc>
@@ -2266,7 +2563,7 @@
               <w:rPr>
                 <w:sz w:val="20"/>
               </w:rPr>
-              <w:t>0 = delete. &lt;1000 = consolidate.</w:t>
+              <w:t>0=delete. &lt;1000=consolidate.</w:t>
             </w:r>
           </w:p>
         </w:tc>
@@ -2307,7 +2604,7 @@
               <w:rPr>
                 <w:sz w:val="20"/>
               </w:rPr>
-              <w:t>&lt;1MB/30d = delete ($32/mo).</w:t>
+              <w:t>&lt;1MB/30d=delete ($32/mo).</w:t>
             </w:r>
           </w:p>
         </w:tc>
@@ -2348,7 +2645,7 @@
               <w:rPr>
                 <w:sz w:val="20"/>
               </w:rPr>
-              <w:t>io1/io2 low IOPS = gp3.</w:t>
+              <w:t>io1/io2 low IOPS=gp3.</w:t>
             </w:r>
           </w:p>
         </w:tc>
@@ -2389,7 +2686,7 @@
               <w:rPr>
                 <w:sz w:val="20"/>
               </w:rPr>
-              <w:t>0 = delete. 100% errors = broken.</w:t>
+              <w:t>0=delete. 100% errors=broken.</w:t>
             </w:r>
           </w:p>
         </w:tc>
@@ -2416,7 +2713,7 @@
         <w:pStyle w:val="ListBullet"/>
       </w:pPr>
       <w:r>
-        <w:t>Cost Efficiency Score: waste + commitment savings + idle EIPs from VPC breakdown</w:t>
+        <w:t>Efficiency Score: waste + commitment savings + idle EIPs</w:t>
       </w:r>
     </w:p>
     <w:p>
@@ -2424,7 +2721,7 @@
         <w:pStyle w:val="ListBullet"/>
       </w:pPr>
       <w:r>
-        <w:t>Pricing Engine: actual instances, actual RDS engine, region-aware, 4 tiers</w:t>
+        <w:t>Pricing: actual instances, actual engine, region-aware, 4 tiers</w:t>
       </w:r>
     </w:p>
     <w:p>
@@ -2432,7 +2729,7 @@
         <w:pStyle w:val="ListBullet"/>
       </w:pPr>
       <w:r>
-        <w:t>Waste Detection: 13+ types (EBS, EIPs, Lambda, ELB, NAT GW, KMS, ECS, S3)</w:t>
+        <w:t>Waste: 13+ types. NON-ACTIONABLE: Tax, Registrar, Cost Explorer</w:t>
       </w:r>
     </w:p>
     <w:p>
@@ -2440,15 +2737,7 @@
         <w:pStyle w:val="ListBullet"/>
       </w:pPr>
       <w:r>
-        <w:t>NON-ACTIONABLE: Tax, Registrar, Cost Explorer, CloudTrail</w:t>
-      </w:r>
-    </w:p>
-    <w:p>
-      <w:pPr>
-        <w:pStyle w:val="ListBullet"/>
-      </w:pPr>
-      <w:r>
-        <w:t>Anomaly Detection: daily cost &gt; 2x 7-day average</w:t>
+        <w:t>Anomaly: daily &gt; 2x 7-day average</w:t>
       </w:r>
     </w:p>
     <w:p>
@@ -2465,6 +2754,102 @@
           <w:color w:val="1A56DB"/>
         </w:rPr>
         <w:t>10. AI Response Logic</w:t>
+      </w:r>
+    </w:p>
+    <w:p>
+      <w:pPr>
+        <w:pStyle w:val="ListBullet"/>
+      </w:pPr>
+      <w:r>
+        <w:t>CO ML &gt; CW &gt; static; memory guard rail; Graviton; scheduling</w:t>
+      </w:r>
+    </w:p>
+    <w:p>
+      <w:pPr>
+        <w:pStyle w:val="ListBullet"/>
+      </w:pPr>
+      <w:r>
+        <w:t>BU-aware: maps team names to allocation rules for filtered analysis</w:t>
+      </w:r>
+    </w:p>
+    <w:p>
+      <w:pPr>
+        <w:pStyle w:val="ListBullet"/>
+      </w:pPr>
+      <w:r>
+        <w:t>NON-ACTIONABLE never in savings; &lt;$0.50 = Minor costs</w:t>
+      </w:r>
+    </w:p>
+    <w:p>
+      <w:pPr>
+        <w:pStyle w:val="ListBullet"/>
+      </w:pPr>
+      <w:r>
+        <w:t>Any-period month comparison; savings sorted by $ impact</w:t>
+      </w:r>
+    </w:p>
+    <w:p>
+      <w:r>
+        <w:br w:type="page"/>
+      </w:r>
+    </w:p>
+    <w:p>
+      <w:pPr>
+        <w:pStyle w:val="Heading1"/>
+      </w:pPr>
+      <w:r>
+        <w:rPr>
+          <w:color w:val="1A56DB"/>
+        </w:rPr>
+        <w:t>11. Learning Cycle</w:t>
+      </w:r>
+    </w:p>
+    <w:p>
+      <w:pPr>
+        <w:pStyle w:val="ListBullet"/>
+      </w:pPr>
+      <w:r>
+        <w:t>👍: positiveCount++, high-confidence tag</w:t>
+      </w:r>
+    </w:p>
+    <w:p>
+      <w:pPr>
+        <w:pStyle w:val="ListBullet"/>
+      </w:pPr>
+      <w:r>
+        <w:t>👎: positiveCount--, tag removed if ≤0</w:t>
+      </w:r>
+    </w:p>
+    <w:p>
+      <w:pPr>
+        <w:pStyle w:val="ListBullet"/>
+      </w:pPr>
+      <w:r>
+        <w:t>Sort: high-confidence &gt; user-feedback &gt; AI-generated &gt; curated</w:t>
+      </w:r>
+    </w:p>
+    <w:p>
+      <w:pPr>
+        <w:pStyle w:val="ListBullet"/>
+      </w:pPr>
+      <w:r>
+        <w:t>Auto-save tips from AI answers; admin Score column + stats</w:t>
+      </w:r>
+    </w:p>
+    <w:p>
+      <w:r>
+        <w:br w:type="page"/>
+      </w:r>
+    </w:p>
+    <w:p>
+      <w:pPr>
+        <w:pStyle w:val="Heading1"/>
+      </w:pPr>
+      <w:r>
+        <w:rPr>
+          <w:color w:val="1A56DB"/>
+        </w:rPr>
+        <w:t>12. Knowledge Base (72 Tips)</w:t>
       </w:r>
     </w:p>
     <w:tbl>
@@ -2489,7 +2874,7 @@
                 <w:b/>
                 <w:sz w:val="20"/>
               </w:rPr>
-              <w:t>Type</w:t>
+              <w:t>Service</w:t>
             </w:r>
           </w:p>
         </w:tc>
@@ -2503,7 +2888,231 @@
                 <w:b/>
                 <w:sz w:val="20"/>
               </w:rPr>
-              <w:t>Strategy</w:t>
+              <w:t>Tips</w:t>
+            </w:r>
+          </w:p>
+        </w:tc>
+      </w:tr>
+      <w:tr>
+        <w:tc>
+          <w:tcPr>
+            <w:tcW w:type="dxa" w:w="4703"/>
+          </w:tcPr>
+          <w:p>
+            <w:r>
+              <w:rPr>
+                <w:sz w:val="20"/>
+              </w:rPr>
+              <w:t>EC2</w:t>
+            </w:r>
+          </w:p>
+        </w:tc>
+        <w:tc>
+          <w:tcPr>
+            <w:tcW w:type="dxa" w:w="4703"/>
+          </w:tcPr>
+          <w:p>
+            <w:r>
+              <w:rPr>
+                <w:sz w:val="20"/>
+              </w:rPr>
+              <w:t>12</w:t>
+            </w:r>
+          </w:p>
+        </w:tc>
+      </w:tr>
+      <w:tr>
+        <w:tc>
+          <w:tcPr>
+            <w:tcW w:type="dxa" w:w="4703"/>
+          </w:tcPr>
+          <w:p>
+            <w:r>
+              <w:rPr>
+                <w:sz w:val="20"/>
+              </w:rPr>
+              <w:t>RDS</w:t>
+            </w:r>
+          </w:p>
+        </w:tc>
+        <w:tc>
+          <w:tcPr>
+            <w:tcW w:type="dxa" w:w="4703"/>
+          </w:tcPr>
+          <w:p>
+            <w:r>
+              <w:rPr>
+                <w:sz w:val="20"/>
+              </w:rPr>
+              <w:t>6</w:t>
+            </w:r>
+          </w:p>
+        </w:tc>
+      </w:tr>
+      <w:tr>
+        <w:tc>
+          <w:tcPr>
+            <w:tcW w:type="dxa" w:w="4703"/>
+          </w:tcPr>
+          <w:p>
+            <w:r>
+              <w:rPr>
+                <w:sz w:val="20"/>
+              </w:rPr>
+              <w:t>S3</w:t>
+            </w:r>
+          </w:p>
+        </w:tc>
+        <w:tc>
+          <w:tcPr>
+            <w:tcW w:type="dxa" w:w="4703"/>
+          </w:tcPr>
+          <w:p>
+            <w:r>
+              <w:rPr>
+                <w:sz w:val="20"/>
+              </w:rPr>
+              <w:t>5</w:t>
+            </w:r>
+          </w:p>
+        </w:tc>
+      </w:tr>
+      <w:tr>
+        <w:tc>
+          <w:tcPr>
+            <w:tcW w:type="dxa" w:w="4703"/>
+          </w:tcPr>
+          <w:p>
+            <w:r>
+              <w:rPr>
+                <w:sz w:val="20"/>
+              </w:rPr>
+              <w:t>ECS/EKS</w:t>
+            </w:r>
+          </w:p>
+        </w:tc>
+        <w:tc>
+          <w:tcPr>
+            <w:tcW w:type="dxa" w:w="4703"/>
+          </w:tcPr>
+          <w:p>
+            <w:r>
+              <w:rPr>
+                <w:sz w:val="20"/>
+              </w:rPr>
+              <w:t>4</w:t>
+            </w:r>
+          </w:p>
+        </w:tc>
+      </w:tr>
+      <w:tr>
+        <w:tc>
+          <w:tcPr>
+            <w:tcW w:type="dxa" w:w="4703"/>
+          </w:tcPr>
+          <w:p>
+            <w:r>
+              <w:rPr>
+                <w:sz w:val="20"/>
+              </w:rPr>
+              <w:t>Lambda</w:t>
+            </w:r>
+          </w:p>
+        </w:tc>
+        <w:tc>
+          <w:tcPr>
+            <w:tcW w:type="dxa" w:w="4703"/>
+          </w:tcPr>
+          <w:p>
+            <w:r>
+              <w:rPr>
+                <w:sz w:val="20"/>
+              </w:rPr>
+              <w:t>3</w:t>
+            </w:r>
+          </w:p>
+        </w:tc>
+      </w:tr>
+      <w:tr>
+        <w:tc>
+          <w:tcPr>
+            <w:tcW w:type="dxa" w:w="4703"/>
+          </w:tcPr>
+          <w:p>
+            <w:r>
+              <w:rPr>
+                <w:sz w:val="20"/>
+              </w:rPr>
+              <w:t>ELB</w:t>
+            </w:r>
+          </w:p>
+        </w:tc>
+        <w:tc>
+          <w:tcPr>
+            <w:tcW w:type="dxa" w:w="4703"/>
+          </w:tcPr>
+          <w:p>
+            <w:r>
+              <w:rPr>
+                <w:sz w:val="20"/>
+              </w:rPr>
+              <w:t>3</w:t>
+            </w:r>
+          </w:p>
+        </w:tc>
+      </w:tr>
+      <w:tr>
+        <w:tc>
+          <w:tcPr>
+            <w:tcW w:type="dxa" w:w="4703"/>
+          </w:tcPr>
+          <w:p>
+            <w:r>
+              <w:rPr>
+                <w:sz w:val="20"/>
+              </w:rPr>
+              <w:t>NAT GW</w:t>
+            </w:r>
+          </w:p>
+        </w:tc>
+        <w:tc>
+          <w:tcPr>
+            <w:tcW w:type="dxa" w:w="4703"/>
+          </w:tcPr>
+          <w:p>
+            <w:r>
+              <w:rPr>
+                <w:sz w:val="20"/>
+              </w:rPr>
+              <w:t>3</w:t>
+            </w:r>
+          </w:p>
+        </w:tc>
+      </w:tr>
+      <w:tr>
+        <w:tc>
+          <w:tcPr>
+            <w:tcW w:type="dxa" w:w="4703"/>
+          </w:tcPr>
+          <w:p>
+            <w:r>
+              <w:rPr>
+                <w:sz w:val="20"/>
+              </w:rPr>
+              <w:t>EBS</w:t>
+            </w:r>
+          </w:p>
+        </w:tc>
+        <w:tc>
+          <w:tcPr>
+            <w:tcW w:type="dxa" w:w="4703"/>
+          </w:tcPr>
+          <w:p>
+            <w:r>
+              <w:rPr>
+                <w:sz w:val="20"/>
+              </w:rPr>
+              <w:t>5</w:t>
             </w:r>
           </w:p>
         </w:tc>
@@ -2531,7 +3140,7 @@
               <w:rPr>
                 <w:sz w:val="20"/>
               </w:rPr>
-              <w:t>Ranked cost + efficiency + savings by $ impact</w:t>
+              <w:t>18</w:t>
             </w:r>
           </w:p>
         </w:tc>
@@ -2546,7 +3155,7 @@
               <w:rPr>
                 <w:sz w:val="20"/>
               </w:rPr>
-              <w:t>Rightsizing</w:t>
+              <w:t>Others</w:t>
             </w:r>
           </w:p>
         </w:tc>
@@ -2559,654 +3168,7 @@
               <w:rPr>
                 <w:sz w:val="20"/>
               </w:rPr>
-              <w:t>CW metrics + CO + verdict + pricing</w:t>
-            </w:r>
-          </w:p>
-        </w:tc>
-      </w:tr>
-      <w:tr>
-        <w:tc>
-          <w:tcPr>
-            <w:tcW w:type="dxa" w:w="4703"/>
-          </w:tcPr>
-          <w:p>
-            <w:r>
-              <w:rPr>
-                <w:sz w:val="20"/>
-              </w:rPr>
-              <w:t>Multi-account</w:t>
-            </w:r>
-          </w:p>
-        </w:tc>
-        <w:tc>
-          <w:tcPr>
-            <w:tcW w:type="dxa" w:w="4703"/>
-          </w:tcPr>
-          <w:p>
-            <w:r>
-              <w:rPr>
-                <w:sz w:val="20"/>
-              </w:rPr>
-              <w:t>Aggregate first, per-account, cross-account</w:t>
-            </w:r>
-          </w:p>
-        </w:tc>
-      </w:tr>
-      <w:tr>
-        <w:tc>
-          <w:tcPr>
-            <w:tcW w:type="dxa" w:w="4703"/>
-          </w:tcPr>
-          <w:p>
-            <w:r>
-              <w:rPr>
-                <w:sz w:val="20"/>
-              </w:rPr>
-              <w:t>Comparison</w:t>
-            </w:r>
-          </w:p>
-        </w:tc>
-        <w:tc>
-          <w:tcPr>
-            <w:tcW w:type="dxa" w:w="4703"/>
-          </w:tcPr>
-          <w:p>
-            <w:r>
-              <w:rPr>
-                <w:sz w:val="20"/>
-              </w:rPr>
-              <w:t>Any number of months, side-by-side</w:t>
-            </w:r>
-          </w:p>
-        </w:tc>
-      </w:tr>
-      <w:tr>
-        <w:tc>
-          <w:tcPr>
-            <w:tcW w:type="dxa" w:w="4703"/>
-          </w:tcPr>
-          <w:p>
-            <w:r>
-              <w:rPr>
-                <w:sz w:val="20"/>
-              </w:rPr>
-              <w:t>Waste</w:t>
-            </w:r>
-          </w:p>
-        </w:tc>
-        <w:tc>
-          <w:tcPr>
-            <w:tcW w:type="dxa" w:w="4703"/>
-          </w:tcPr>
-          <w:p>
-            <w:r>
-              <w:rPr>
-                <w:sz w:val="20"/>
-              </w:rPr>
-              <w:t>Only concrete evidence, no generic advice</w:t>
-            </w:r>
-          </w:p>
-        </w:tc>
-      </w:tr>
-    </w:tbl>
-    <w:p>
-      <w:pPr>
-        <w:pStyle w:val="ListBullet"/>
-      </w:pPr>
-      <w:r>
-        <w:t>CO ML &gt; CW &gt; static thresholds; memory guard rail; Graviton; scheduling</w:t>
-      </w:r>
-    </w:p>
-    <w:p>
-      <w:pPr>
-        <w:pStyle w:val="ListBullet"/>
-      </w:pPr>
-      <w:r>
-        <w:t>NON-ACTIONABLE services never in savings; services &lt;$0.50 = Minor costs</w:t>
-      </w:r>
-    </w:p>
-    <w:p>
-      <w:r>
-        <w:br w:type="page"/>
-      </w:r>
-    </w:p>
-    <w:p>
-      <w:pPr>
-        <w:pStyle w:val="Heading1"/>
-      </w:pPr>
-      <w:r>
-        <w:rPr>
-          <w:color w:val="1A56DB"/>
-        </w:rPr>
-        <w:t>11. Learning Cycle &amp; Tip Scoring</w:t>
-      </w:r>
-    </w:p>
-    <w:p>
-      <w:pPr>
-        <w:pStyle w:val="ListBullet"/>
-      </w:pPr>
-      <w:r>
-        <w:t>👍 increments positiveCount, sets high-confidence tag</w:t>
-      </w:r>
-    </w:p>
-    <w:p>
-      <w:pPr>
-        <w:pStyle w:val="ListBullet"/>
-      </w:pPr>
-      <w:r>
-        <w:t>👎 decrements positiveCount, removes tag if ≤0</w:t>
-      </w:r>
-    </w:p>
-    <w:p>
-      <w:pPr>
-        <w:pStyle w:val="ListBullet"/>
-      </w:pPr>
-      <w:r>
-        <w:t>Tips sorted: high-confidence &gt; user-feedback &gt; AI-generated &gt; curated</w:t>
-      </w:r>
-    </w:p>
-    <w:p>
-      <w:pPr>
-        <w:pStyle w:val="ListBullet"/>
-      </w:pPr>
-      <w:r>
-        <w:t>AI verifies tips against actual CloudWatch data before recommending</w:t>
-      </w:r>
-    </w:p>
-    <w:p>
-      <w:pPr>
-        <w:pStyle w:val="ListBullet"/>
-      </w:pPr>
-      <w:r>
-        <w:t>Auto-save: AI answers with optimization advice saved as tips</w:t>
-      </w:r>
-    </w:p>
-    <w:p>
-      <w:pPr>
-        <w:pStyle w:val="ListBullet"/>
-      </w:pPr>
-      <w:r>
-        <w:t>Admin: Score column, ✓ badge, feedback stats dashboard</w:t>
-      </w:r>
-    </w:p>
-    <w:p>
-      <w:r>
-        <w:br w:type="page"/>
-      </w:r>
-    </w:p>
-    <w:p>
-      <w:pPr>
-        <w:pStyle w:val="Heading1"/>
-      </w:pPr>
-      <w:r>
-        <w:rPr>
-          <w:color w:val="1A56DB"/>
-        </w:rPr>
-        <w:t>12. Knowledge Base (72 Tips)</w:t>
-      </w:r>
-    </w:p>
-    <w:tbl>
-      <w:tblPr>
-        <w:tblStyle w:val="LightGrid-Accent1"/>
-        <w:tblW w:type="auto" w:w="0"/>
-        <w:jc w:val="left"/>
-        <w:tblLook w:firstColumn="1" w:firstRow="1" w:lastColumn="0" w:lastRow="0" w:noHBand="0" w:noVBand="1" w:val="04A0"/>
-      </w:tblPr>
-      <w:tblGrid>
-        <w:gridCol w:w="3135"/>
-        <w:gridCol w:w="3135"/>
-        <w:gridCol w:w="3135"/>
-      </w:tblGrid>
-      <w:tr>
-        <w:tc>
-          <w:tcPr>
-            <w:tcW w:type="dxa" w:w="3135"/>
-          </w:tcPr>
-          <w:p>
-            <w:r>
-              <w:rPr>
-                <w:b/>
-                <w:sz w:val="20"/>
-              </w:rPr>
-              <w:t>Service</w:t>
-            </w:r>
-          </w:p>
-        </w:tc>
-        <w:tc>
-          <w:tcPr>
-            <w:tcW w:type="dxa" w:w="3135"/>
-          </w:tcPr>
-          <w:p>
-            <w:r>
-              <w:rPr>
-                <w:b/>
-                <w:sz w:val="20"/>
-              </w:rPr>
-              <w:t>Tips</w:t>
-            </w:r>
-          </w:p>
-        </w:tc>
-        <w:tc>
-          <w:tcPr>
-            <w:tcW w:type="dxa" w:w="3135"/>
-          </w:tcPr>
-          <w:p>
-            <w:r>
-              <w:rPr>
-                <w:b/>
-                <w:sz w:val="20"/>
-              </w:rPr>
-              <w:t>Checks</w:t>
-            </w:r>
-          </w:p>
-        </w:tc>
-      </w:tr>
-      <w:tr>
-        <w:tc>
-          <w:tcPr>
-            <w:tcW w:type="dxa" w:w="3135"/>
-          </w:tcPr>
-          <w:p>
-            <w:r>
-              <w:rPr>
-                <w:sz w:val="20"/>
-              </w:rPr>
-              <w:t>EC2</w:t>
-            </w:r>
-          </w:p>
-        </w:tc>
-        <w:tc>
-          <w:tcPr>
-            <w:tcW w:type="dxa" w:w="3135"/>
-          </w:tcPr>
-          <w:p>
-            <w:r>
-              <w:rPr>
-                <w:sz w:val="20"/>
-              </w:rPr>
-              <w:t>12</w:t>
-            </w:r>
-          </w:p>
-        </w:tc>
-        <w:tc>
-          <w:tcPr>
-            <w:tcW w:type="dxa" w:w="3135"/>
-          </w:tcPr>
-          <w:p>
-            <w:r>
-              <w:rPr>
-                <w:sz w:val="20"/>
-              </w:rPr>
-              <w:t>CO ML, CPU+Memory, Graviton, Scheduling, ASG, Spot</w:t>
-            </w:r>
-          </w:p>
-        </w:tc>
-      </w:tr>
-      <w:tr>
-        <w:tc>
-          <w:tcPr>
-            <w:tcW w:type="dxa" w:w="3135"/>
-          </w:tcPr>
-          <w:p>
-            <w:r>
-              <w:rPr>
-                <w:sz w:val="20"/>
-              </w:rPr>
-              <w:t>RDS</w:t>
-            </w:r>
-          </w:p>
-        </w:tc>
-        <w:tc>
-          <w:tcPr>
-            <w:tcW w:type="dxa" w:w="3135"/>
-          </w:tcPr>
-          <w:p>
-            <w:r>
-              <w:rPr>
-                <w:sz w:val="20"/>
-              </w:rPr>
-              <w:t>6</w:t>
-            </w:r>
-          </w:p>
-        </w:tc>
-        <w:tc>
-          <w:tcPr>
-            <w:tcW w:type="dxa" w:w="3135"/>
-          </w:tcPr>
-          <w:p>
-            <w:r>
-              <w:rPr>
-                <w:sz w:val="20"/>
-              </w:rPr>
-              <w:t>CPU/Memory/IOPS, engine, RI/SP, replicas</w:t>
-            </w:r>
-          </w:p>
-        </w:tc>
-      </w:tr>
-      <w:tr>
-        <w:tc>
-          <w:tcPr>
-            <w:tcW w:type="dxa" w:w="3135"/>
-          </w:tcPr>
-          <w:p>
-            <w:r>
-              <w:rPr>
-                <w:sz w:val="20"/>
-              </w:rPr>
-              <w:t>S3</w:t>
-            </w:r>
-          </w:p>
-        </w:tc>
-        <w:tc>
-          <w:tcPr>
-            <w:tcW w:type="dxa" w:w="3135"/>
-          </w:tcPr>
-          <w:p>
-            <w:r>
-              <w:rPr>
-                <w:sz w:val="20"/>
-              </w:rPr>
-              <w:t>5</w:t>
-            </w:r>
-          </w:p>
-        </w:tc>
-        <w:tc>
-          <w:tcPr>
-            <w:tcW w:type="dxa" w:w="3135"/>
-          </w:tcPr>
-          <w:p>
-            <w:r>
-              <w:rPr>
-                <w:sz w:val="20"/>
-              </w:rPr>
-              <w:t>Lifecycle, Intelligent-Tiering, Storage Lens</w:t>
-            </w:r>
-          </w:p>
-        </w:tc>
-      </w:tr>
-      <w:tr>
-        <w:tc>
-          <w:tcPr>
-            <w:tcW w:type="dxa" w:w="3135"/>
-          </w:tcPr>
-          <w:p>
-            <w:r>
-              <w:rPr>
-                <w:sz w:val="20"/>
-              </w:rPr>
-              <w:t>ECS/EKS</w:t>
-            </w:r>
-          </w:p>
-        </w:tc>
-        <w:tc>
-          <w:tcPr>
-            <w:tcW w:type="dxa" w:w="3135"/>
-          </w:tcPr>
-          <w:p>
-            <w:r>
-              <w:rPr>
-                <w:sz w:val="20"/>
-              </w:rPr>
-              <w:t>4</w:t>
-            </w:r>
-          </w:p>
-        </w:tc>
-        <w:tc>
-          <w:tcPr>
-            <w:tcW w:type="dxa" w:w="3135"/>
-          </w:tcPr>
-          <w:p>
-            <w:r>
-              <w:rPr>
-                <w:sz w:val="20"/>
-              </w:rPr>
-              <w:t>Service CPU+Memory, Karpenter, auto-scaling</w:t>
-            </w:r>
-          </w:p>
-        </w:tc>
-      </w:tr>
-      <w:tr>
-        <w:tc>
-          <w:tcPr>
-            <w:tcW w:type="dxa" w:w="3135"/>
-          </w:tcPr>
-          <w:p>
-            <w:r>
-              <w:rPr>
-                <w:sz w:val="20"/>
-              </w:rPr>
-              <w:t>Lambda</w:t>
-            </w:r>
-          </w:p>
-        </w:tc>
-        <w:tc>
-          <w:tcPr>
-            <w:tcW w:type="dxa" w:w="3135"/>
-          </w:tcPr>
-          <w:p>
-            <w:r>
-              <w:rPr>
-                <w:sz w:val="20"/>
-              </w:rPr>
-              <w:t>3</w:t>
-            </w:r>
-          </w:p>
-        </w:tc>
-        <w:tc>
-          <w:tcPr>
-            <w:tcW w:type="dxa" w:w="3135"/>
-          </w:tcPr>
-          <w:p>
-            <w:r>
-              <w:rPr>
-                <w:sz w:val="20"/>
-              </w:rPr>
-              <w:t>Invocations, duration, ARM</w:t>
-            </w:r>
-          </w:p>
-        </w:tc>
-      </w:tr>
-      <w:tr>
-        <w:tc>
-          <w:tcPr>
-            <w:tcW w:type="dxa" w:w="3135"/>
-          </w:tcPr>
-          <w:p>
-            <w:r>
-              <w:rPr>
-                <w:sz w:val="20"/>
-              </w:rPr>
-              <w:t>ELB</w:t>
-            </w:r>
-          </w:p>
-        </w:tc>
-        <w:tc>
-          <w:tcPr>
-            <w:tcW w:type="dxa" w:w="3135"/>
-          </w:tcPr>
-          <w:p>
-            <w:r>
-              <w:rPr>
-                <w:sz w:val="20"/>
-              </w:rPr>
-              <w:t>3</w:t>
-            </w:r>
-          </w:p>
-        </w:tc>
-        <w:tc>
-          <w:tcPr>
-            <w:tcW w:type="dxa" w:w="3135"/>
-          </w:tcPr>
-          <w:p>
-            <w:r>
-              <w:rPr>
-                <w:sz w:val="20"/>
-              </w:rPr>
-              <w:t>Requests, idle, CloudFront offload</w:t>
-            </w:r>
-          </w:p>
-        </w:tc>
-      </w:tr>
-      <w:tr>
-        <w:tc>
-          <w:tcPr>
-            <w:tcW w:type="dxa" w:w="3135"/>
-          </w:tcPr>
-          <w:p>
-            <w:r>
-              <w:rPr>
-                <w:sz w:val="20"/>
-              </w:rPr>
-              <w:t>NAT GW</w:t>
-            </w:r>
-          </w:p>
-        </w:tc>
-        <w:tc>
-          <w:tcPr>
-            <w:tcW w:type="dxa" w:w="3135"/>
-          </w:tcPr>
-          <w:p>
-            <w:r>
-              <w:rPr>
-                <w:sz w:val="20"/>
-              </w:rPr>
-              <w:t>3</w:t>
-            </w:r>
-          </w:p>
-        </w:tc>
-        <w:tc>
-          <w:tcPr>
-            <w:tcW w:type="dxa" w:w="3135"/>
-          </w:tcPr>
-          <w:p>
-            <w:r>
-              <w:rPr>
-                <w:sz w:val="20"/>
-              </w:rPr>
-              <w:t>Bytes, connections, VPC endpoints</w:t>
-            </w:r>
-          </w:p>
-        </w:tc>
-      </w:tr>
-      <w:tr>
-        <w:tc>
-          <w:tcPr>
-            <w:tcW w:type="dxa" w:w="3135"/>
-          </w:tcPr>
-          <w:p>
-            <w:r>
-              <w:rPr>
-                <w:sz w:val="20"/>
-              </w:rPr>
-              <w:t>EBS</w:t>
-            </w:r>
-          </w:p>
-        </w:tc>
-        <w:tc>
-          <w:tcPr>
-            <w:tcW w:type="dxa" w:w="3135"/>
-          </w:tcPr>
-          <w:p>
-            <w:r>
-              <w:rPr>
-                <w:sz w:val="20"/>
-              </w:rPr>
-              <w:t>5</w:t>
-            </w:r>
-          </w:p>
-        </w:tc>
-        <w:tc>
-          <w:tcPr>
-            <w:tcW w:type="dxa" w:w="3135"/>
-          </w:tcPr>
-          <w:p>
-            <w:r>
-              <w:rPr>
-                <w:sz w:val="20"/>
-              </w:rPr>
-              <w:t>IOPS, unattached, gp2→gp3, snapshots</w:t>
-            </w:r>
-          </w:p>
-        </w:tc>
-      </w:tr>
-      <w:tr>
-        <w:tc>
-          <w:tcPr>
-            <w:tcW w:type="dxa" w:w="3135"/>
-          </w:tcPr>
-          <w:p>
-            <w:r>
-              <w:rPr>
-                <w:sz w:val="20"/>
-              </w:rPr>
-              <w:t>General</w:t>
-            </w:r>
-          </w:p>
-        </w:tc>
-        <w:tc>
-          <w:tcPr>
-            <w:tcW w:type="dxa" w:w="3135"/>
-          </w:tcPr>
-          <w:p>
-            <w:r>
-              <w:rPr>
-                <w:sz w:val="20"/>
-              </w:rPr>
-              <w:t>18</w:t>
-            </w:r>
-          </w:p>
-        </w:tc>
-        <w:tc>
-          <w:tcPr>
-            <w:tcW w:type="dxa" w:w="3135"/>
-          </w:tcPr>
-          <w:p>
-            <w:r>
-              <w:rPr>
-                <w:sz w:val="20"/>
-              </w:rPr>
-              <w:t>SP, budgets, anomaly, tagging, scheduling</w:t>
-            </w:r>
-          </w:p>
-        </w:tc>
-      </w:tr>
-      <w:tr>
-        <w:tc>
-          <w:tcPr>
-            <w:tcW w:type="dxa" w:w="3135"/>
-          </w:tcPr>
-          <w:p>
-            <w:r>
-              <w:rPr>
-                <w:sz w:val="20"/>
-              </w:rPr>
-              <w:t>Others</w:t>
-            </w:r>
-          </w:p>
-        </w:tc>
-        <w:tc>
-          <w:tcPr>
-            <w:tcW w:type="dxa" w:w="3135"/>
-          </w:tcPr>
-          <w:p>
-            <w:r>
-              <w:rPr>
-                <w:sz w:val="20"/>
-              </w:rPr>
               <w:t>13</w:t>
-            </w:r>
-          </w:p>
-        </w:tc>
-        <w:tc>
-          <w:tcPr>
-            <w:tcW w:type="dxa" w:w="3135"/>
-          </w:tcPr>
-          <w:p>
-            <w:r>
-              <w:rPr>
-                <w:sz w:val="20"/>
-              </w:rPr>
-              <w:t>KMS, CloudFront, ElastiCache, DynamoDB, EFS, Data Transfer</w:t>
             </w:r>
           </w:p>
         </w:tc>
@@ -3233,7 +3195,7 @@
         <w:pStyle w:val="ListBullet"/>
       </w:pPr>
       <w:r>
-        <w:t>Apache ECharts v5: dynamic type switching, treemap, dark theme</w:t>
+        <w:t>ECharts v5: dynamic type switching, treemap, dark theme</w:t>
       </w:r>
     </w:p>
     <w:p>
@@ -3241,23 +3203,7 @@
         <w:pStyle w:val="ListBullet"/>
       </w:pPr>
       <w:r>
-        <w:t>Chart types: Bar, Pie, Line, Treemap, Grouped Bar</w:t>
-      </w:r>
-    </w:p>
-    <w:p>
-      <w:pPr>
-        <w:pStyle w:val="ListBullet"/>
-      </w:pPr>
-      <w:r>
-        <w:t>Service follow-up topics: 22 mappings to investigative questions</w:t>
-      </w:r>
-    </w:p>
-    <w:p>
-      <w:pPr>
-        <w:pStyle w:val="ListBullet"/>
-      </w:pPr>
-      <w:r>
-        <w:t>Comparison tables parsed from AI answer text</w:t>
+        <w:t>Service follow-ups: 22 mappings. Comparison table parsing.</w:t>
       </w:r>
     </w:p>
     <w:p>
@@ -3289,7 +3235,7 @@
         <w:pStyle w:val="ListBullet"/>
       </w:pPr>
       <w:r>
-        <w:t>Leads Tab: CRUD, bulk delete, sync billing</w:t>
+        <w:t>Tips: Score (+N/-N), ✓ validated, ⚙ Check badge</w:t>
       </w:r>
     </w:p>
     <w:p>
@@ -3297,15 +3243,7 @@
         <w:pStyle w:val="ListBullet"/>
       </w:pPr>
       <w:r>
-        <w:t>Tips Tab: 72+ tips, Score column (+N/-N), ✓ validated badge, ⚙ Check badge</w:t>
-      </w:r>
-    </w:p>
-    <w:p>
-      <w:pPr>
-        <w:pStyle w:val="ListBullet"/>
-      </w:pPr>
-      <w:r>
-        <w:t>Feedback Tab: stats dashboard (Total, Positive Rate %, Corrections, Top Services)</w:t>
+        <w:t>Feedback: stats dashboard (Total, Rate %, Corrections, Top Services)</w:t>
       </w:r>
     </w:p>
     <w:p>
@@ -3515,7 +3453,7 @@
               <w:rPr>
                 <w:sz w:val="20"/>
               </w:rPr>
-              <w:t>Deployment</w:t>
+              <w:t>Deploy</w:t>
             </w:r>
           </w:p>
         </w:tc>
@@ -3548,11 +3486,6 @@
           <w:color w:val="1A56DB"/>
         </w:rPr>
         <w:t>16. Infrastructure</w:t>
-      </w:r>
-    </w:p>
-    <w:p>
-      <w:r>
-        <w:t>Stack: aws-bill-analyzer-viewmybill | 7 Lambdas | 7 DynamoDB tables | us-east-1</w:t>
       </w:r>
     </w:p>
     <w:tbl>
@@ -3675,7 +3608,7 @@
               <w:rPr>
                 <w:sz w:val="20"/>
               </w:rPr>
-              <w:t>allocationRules, favoriteQueries</w:t>
+              <w:t>allocationRules (businessUnits, sharedCostMode, status)</w:t>
             </w:r>
           </w:p>
         </w:tc>
@@ -3837,7 +3770,7 @@
               <w:rPr>
                 <w:sz w:val="20"/>
               </w:rPr>
-              <w:t>feedbackScore, relatedService, userCorrection</w:t>
+              <w:t>feedbackScore, relatedService</w:t>
             </w:r>
           </w:p>
         </w:tc>
@@ -3891,7 +3824,7 @@
               <w:rPr>
                 <w:sz w:val="20"/>
               </w:rPr>
-              <w:t>billTotalCost, monthlySavings</w:t>
+              <w:t>billTotalCost</w:t>
             </w:r>
           </w:p>
         </w:tc>
@@ -3969,7 +3902,7 @@
     </w:p>
     <w:p>
       <w:r>
-        <w:t>GitHub Actions + OIDC. 7 Lambdas, CF stack, 72 tips, 3 frontends, CloudFront invalidation.</w:t>
+        <w:t>GitHub Actions + OIDC. 7 Lambdas, CF stack, 72 tips, 3 frontends, CloudFront.</w:t>
       </w:r>
     </w:p>
     <w:p>
@@ -4151,7 +4084,7 @@
               <w:rPr>
                 <w:sz w:val="20"/>
               </w:rPr>
-              <w:t>AI Agent</w:t>
+              <w:t>AI</w:t>
             </w:r>
           </w:p>
         </w:tc>
@@ -4207,7 +4140,7 @@
               <w:rPr>
                 <w:sz w:val="20"/>
               </w:rPr>
-              <w:t>Allocation</w:t>
+              <w:t>Virtual Tagging</w:t>
             </w:r>
           </w:p>
         </w:tc>

</xml_diff>